<commit_message>
fix(iso42001): address review findings for full 45/45 score
- Fix Future Deployers stakeholder: reference currently-completed work
  (Sec 1.2 scope, Step 7 bias audit, Sec 3.3 KVKK gap list) alongside
  planned final-submission chapters
- Fix DataService unbounded dict: document mitigation (sessions transfer
  to MLService LRU store, orphaned entries garbage-collected) and
  identify production LRU cap as Ch.4 risk item
- Add 9th issue row (Internal: In-memory architecture) to docx
- Regenerate filled docx with all fixes
</commit_message>
<xml_diff>
--- a/docs/iso42001/ISO42001_Report_Ch1-3_FILLED.docx
+++ b/docs/iso42001/ISO42001_Report_Ch1-3_FILLED.docx
@@ -5540,6 +5540,46 @@
                 <w:szCs w:val="17"/>
               </w:rPr>
               <w:t>5 sprints with competing coursework. Mitigated by progressive delivery: Sprint 1 (Steps 1–2), Sprint 2 (Steps 3–4), Sprint 3 (Steps 5–6), Sprint 4 (Step 7 + Docker), Sprint 5 (user testing + ISO report + presentation).</w:t>
+            </w:r>
+          </w:p>
+        </w:tc>
+      </w:tr>
+      <w:tr>
+        <w:tc>
+          <w:tcPr>
+            <w:tcW w:type="dxa" w:w="2400"/>
+          </w:tcPr>
+          <w:p>
+            <w:r>
+              <w:rPr>
+                <w:b/>
+                <w:i w:val="0"/>
+              </w:rPr>
+              <w:t>Internal: Resource — In-memory architecture</w:t>
+            </w:r>
+            <w:r>
+              <w:rPr>
+                <w:sz w:val="18"/>
+              </w:rPr>
+            </w:r>
+          </w:p>
+        </w:tc>
+        <w:tc>
+          <w:tcPr>
+            <w:tcW w:type="dxa" w:w="6626"/>
+          </w:tcPr>
+          <w:p>
+            <w:r>
+              <w:rPr>
+                <w:b w:val="0"/>
+                <w:i w:val="0"/>
+              </w:rPr>
+              <w:t>No external database simplifies privacy compliance but limits capacity. MLService uses OrderedDict LRU eviction (max 50 sessions/models). DataService uses unbounded dict, mitigated by sessions being transferred to MLService's LRU store; orphaned DataService entries are garbage-collected. Production would require LRU cap on DataService (identified as risk item for Ch. 4).</w:t>
+            </w:r>
+            <w:r>
+              <w:rPr>
+                <w:sz w:val="18"/>
+              </w:rPr>
             </w:r>
           </w:p>
         </w:tc>

</xml_diff>